<commit_message>
Fix AI 5D criteria auto-detection and update Chapter 4 documentation with diagrams and screenshots
</commit_message>
<xml_diff>
--- a/docs/CHAPTER_FOUR_SYSTEM_IMPLEMENTATION_AND_TESTING.docx
+++ b/docs/CHAPTER_FOUR_SYSTEM_IMPLEMENTATION_AND_TESTING.docx
@@ -5,6 +5,7 @@
     <w:p>
       <w:pPr>
         <w:spacing w:after="200" w:line="276" w:lineRule="auto"/>
+        <w:ind w:left="720"/>
         <w:rPr>
           <w:b/>
           <w:color w:val="1E1B4B"/>
@@ -23,6 +24,7 @@
     <w:p>
       <w:pPr>
         <w:spacing w:before="240" w:after="80"/>
+        <w:ind w:left="720"/>
         <w:jc w:val="center"/>
       </w:pPr>
       <w:r>
@@ -38,6 +40,7 @@
     <w:p>
       <w:pPr>
         <w:spacing w:after="360"/>
+        <w:ind w:left="720"/>
         <w:jc w:val="center"/>
       </w:pPr>
       <w:r>
@@ -52,6 +55,7 @@
     <w:p>
       <w:pPr>
         <w:spacing w:before="280" w:after="80"/>
+        <w:ind w:left="720"/>
       </w:pPr>
       <w:r>
         <w:rPr>
@@ -64,6 +68,7 @@
     </w:p>
     <w:p>
       <w:pPr>
+        <w:ind w:left="720"/>
         <w:jc w:val="both"/>
       </w:pPr>
       <w:r>
@@ -72,6 +77,7 @@
     </w:p>
     <w:p>
       <w:pPr>
+        <w:ind w:left="720"/>
         <w:jc w:val="both"/>
       </w:pPr>
       <w:r>
@@ -81,6 +87,7 @@
     <w:p>
       <w:pPr>
         <w:spacing w:before="280" w:after="80"/>
+        <w:ind w:left="720"/>
       </w:pPr>
       <w:r>
         <w:rPr>
@@ -93,6 +100,7 @@
     </w:p>
     <w:p>
       <w:pPr>
+        <w:ind w:left="720"/>
         <w:jc w:val="both"/>
       </w:pPr>
       <w:r>
@@ -102,6 +110,7 @@
     <w:p>
       <w:pPr>
         <w:spacing w:before="200" w:after="60"/>
+        <w:ind w:left="720"/>
       </w:pPr>
       <w:r>
         <w:rPr>
@@ -115,7 +124,12 @@
     <w:p>
       <w:pPr>
         <w:pStyle w:val="ListBullet"/>
+        <w:tabs>
+          <w:tab w:val="clear" w:pos="360"/>
+          <w:tab w:val="num" w:pos="1080"/>
+        </w:tabs>
         <w:spacing w:after="60"/>
+        <w:ind w:left="1080"/>
         <w:jc w:val="both"/>
       </w:pPr>
       <w:r>
@@ -131,7 +145,12 @@
     <w:p>
       <w:pPr>
         <w:pStyle w:val="ListBullet"/>
+        <w:tabs>
+          <w:tab w:val="clear" w:pos="360"/>
+          <w:tab w:val="num" w:pos="1080"/>
+        </w:tabs>
         <w:spacing w:after="60"/>
+        <w:ind w:left="1080"/>
         <w:jc w:val="both"/>
       </w:pPr>
       <w:r>
@@ -147,7 +166,12 @@
     <w:p>
       <w:pPr>
         <w:pStyle w:val="ListBullet"/>
+        <w:tabs>
+          <w:tab w:val="clear" w:pos="360"/>
+          <w:tab w:val="num" w:pos="1080"/>
+        </w:tabs>
         <w:spacing w:after="60"/>
+        <w:ind w:left="1080"/>
         <w:jc w:val="both"/>
       </w:pPr>
       <w:r>
@@ -164,7 +188,12 @@
     <w:p>
       <w:pPr>
         <w:pStyle w:val="ListBullet"/>
+        <w:tabs>
+          <w:tab w:val="clear" w:pos="360"/>
+          <w:tab w:val="num" w:pos="1080"/>
+        </w:tabs>
         <w:spacing w:after="60"/>
+        <w:ind w:left="1080"/>
         <w:jc w:val="both"/>
       </w:pPr>
       <w:r>
@@ -180,7 +209,12 @@
     <w:p>
       <w:pPr>
         <w:pStyle w:val="ListBullet"/>
+        <w:tabs>
+          <w:tab w:val="clear" w:pos="360"/>
+          <w:tab w:val="num" w:pos="1080"/>
+        </w:tabs>
         <w:spacing w:after="60"/>
+        <w:ind w:left="1080"/>
         <w:jc w:val="both"/>
       </w:pPr>
       <w:r>
@@ -196,6 +230,7 @@
     <w:p>
       <w:pPr>
         <w:spacing w:before="200" w:after="60"/>
+        <w:ind w:left="720"/>
       </w:pPr>
       <w:r>
         <w:rPr>
@@ -208,6 +243,7 @@
     </w:p>
     <w:p>
       <w:pPr>
+        <w:ind w:left="720"/>
         <w:jc w:val="both"/>
       </w:pPr>
       <w:r>
@@ -217,6 +253,7 @@
     <w:p>
       <w:pPr>
         <w:spacing w:before="80" w:after="40"/>
+        <w:ind w:left="720"/>
       </w:pPr>
       <w:r>
         <w:rPr>
@@ -228,7 +265,7 @@
     </w:p>
     <w:tbl>
       <w:tblPr>
-        <w:tblW w:w="0" w:type="auto"/>
+        <w:tblW w:w="9360" w:type="dxa"/>
         <w:jc w:val="center"/>
         <w:tblLook w:val="04A0" w:firstRow="1" w:lastRow="0" w:firstColumn="1" w:lastColumn="0" w:noHBand="0" w:noVBand="1"/>
       </w:tblPr>
@@ -1094,14 +1131,14 @@
               <w:rPr>
                 <w:sz w:val="19"/>
               </w:rPr>
-              <w:t xml:space="preserve">Demographic parity evaluation and disparity </w:t>
+              <w:t xml:space="preserve">Demographic parity </w:t>
             </w:r>
             <w:r>
               <w:rPr>
                 <w:sz w:val="19"/>
               </w:rPr>
               <w:lastRenderedPageBreak/>
-              <w:t>ratio validation across groups</w:t>
+              <w:t>evaluation and disparity ratio validation across groups</w:t>
             </w:r>
           </w:p>
         </w:tc>
@@ -1678,10 +1715,15 @@
         </w:tc>
       </w:tr>
     </w:tbl>
-    <w:p/>
+    <w:p>
+      <w:pPr>
+        <w:ind w:left="720"/>
+      </w:pPr>
+    </w:p>
     <w:p>
       <w:pPr>
         <w:spacing w:before="280" w:after="80"/>
+        <w:ind w:left="720"/>
       </w:pPr>
       <w:r>
         <w:rPr>
@@ -1694,6 +1736,7 @@
     </w:p>
     <w:p>
       <w:pPr>
+        <w:ind w:left="720"/>
         <w:jc w:val="both"/>
       </w:pPr>
       <w:r>
@@ -1703,6 +1746,7 @@
     <w:p>
       <w:pPr>
         <w:spacing w:before="200" w:after="60"/>
+        <w:ind w:left="720"/>
       </w:pPr>
       <w:r>
         <w:rPr>
@@ -1715,6 +1759,7 @@
     </w:p>
     <w:p>
       <w:pPr>
+        <w:ind w:left="720"/>
         <w:jc w:val="both"/>
       </w:pPr>
       <w:r>
@@ -1723,6 +1768,7 @@
     </w:p>
     <w:p>
       <w:pPr>
+        <w:ind w:left="720"/>
         <w:jc w:val="both"/>
       </w:pPr>
       <w:r>
@@ -1733,6 +1779,7 @@
     <w:p>
       <w:pPr>
         <w:spacing w:before="120"/>
+        <w:ind w:left="720"/>
         <w:jc w:val="center"/>
       </w:pPr>
       <w:r>
@@ -1748,6 +1795,7 @@
     <w:p>
       <w:pPr>
         <w:spacing w:before="200" w:after="60"/>
+        <w:ind w:left="720"/>
       </w:pPr>
       <w:r>
         <w:rPr>
@@ -1760,6 +1808,7 @@
     </w:p>
     <w:p>
       <w:pPr>
+        <w:ind w:left="720"/>
         <w:jc w:val="both"/>
       </w:pPr>
       <w:r>
@@ -1769,6 +1818,7 @@
     <w:p>
       <w:pPr>
         <w:spacing w:before="200" w:after="60"/>
+        <w:ind w:left="720"/>
       </w:pPr>
       <w:r>
         <w:rPr>
@@ -1781,6 +1831,7 @@
     </w:p>
     <w:p>
       <w:pPr>
+        <w:ind w:left="720"/>
         <w:jc w:val="both"/>
       </w:pPr>
       <w:r>
@@ -1790,6 +1841,7 @@
     <w:p>
       <w:pPr>
         <w:spacing w:before="200" w:after="60"/>
+        <w:ind w:left="720"/>
       </w:pPr>
       <w:r>
         <w:rPr>
@@ -1802,6 +1854,7 @@
     </w:p>
     <w:p>
       <w:pPr>
+        <w:ind w:left="720"/>
         <w:jc w:val="both"/>
       </w:pPr>
       <w:r>
@@ -1811,7 +1864,12 @@
     <w:p>
       <w:pPr>
         <w:pStyle w:val="ListBullet"/>
+        <w:tabs>
+          <w:tab w:val="clear" w:pos="360"/>
+          <w:tab w:val="num" w:pos="1080"/>
+        </w:tabs>
         <w:spacing w:after="60"/>
+        <w:ind w:left="1080"/>
         <w:jc w:val="both"/>
       </w:pPr>
       <w:r>
@@ -1827,6 +1885,7 @@
     <w:p>
       <w:pPr>
         <w:spacing w:before="120"/>
+        <w:ind w:left="720"/>
         <w:jc w:val="center"/>
       </w:pPr>
       <w:r>
@@ -1842,13 +1901,19 @@
     <w:p>
       <w:pPr>
         <w:pStyle w:val="ListBullet"/>
+        <w:tabs>
+          <w:tab w:val="clear" w:pos="360"/>
+          <w:tab w:val="num" w:pos="1080"/>
+        </w:tabs>
         <w:spacing w:after="60"/>
+        <w:ind w:left="1080"/>
         <w:jc w:val="both"/>
       </w:pPr>
       <w:r>
         <w:rPr>
           <w:b/>
         </w:rPr>
+        <w:lastRenderedPageBreak/>
         <w:t xml:space="preserve">2. Soft Competencies (S_s): </w:t>
       </w:r>
       <w:r>
@@ -1858,14 +1923,18 @@
     <w:p>
       <w:pPr>
         <w:pStyle w:val="ListBullet"/>
+        <w:tabs>
+          <w:tab w:val="clear" w:pos="360"/>
+          <w:tab w:val="num" w:pos="1080"/>
+        </w:tabs>
         <w:spacing w:after="60"/>
+        <w:ind w:left="1080"/>
         <w:jc w:val="both"/>
       </w:pPr>
       <w:r>
         <w:rPr>
           <w:b/>
         </w:rPr>
-        <w:lastRenderedPageBreak/>
         <w:t xml:space="preserve">3. Role Title Proximity (S_t): </w:t>
       </w:r>
       <w:r>
@@ -1875,7 +1944,12 @@
     <w:p>
       <w:pPr>
         <w:pStyle w:val="ListBullet"/>
+        <w:tabs>
+          <w:tab w:val="clear" w:pos="360"/>
+          <w:tab w:val="num" w:pos="1080"/>
+        </w:tabs>
         <w:spacing w:after="60"/>
+        <w:ind w:left="1080"/>
         <w:jc w:val="both"/>
       </w:pPr>
       <w:r>
@@ -1891,6 +1965,7 @@
     <w:p>
       <w:pPr>
         <w:spacing w:before="120"/>
+        <w:ind w:left="720"/>
         <w:jc w:val="center"/>
       </w:pPr>
       <w:r>
@@ -1906,6 +1981,7 @@
     <w:p>
       <w:pPr>
         <w:spacing w:before="120"/>
+        <w:ind w:left="720"/>
         <w:jc w:val="center"/>
       </w:pPr>
       <w:r>
@@ -1921,6 +1997,7 @@
     <w:p>
       <w:pPr>
         <w:spacing w:before="120"/>
+        <w:ind w:left="720"/>
         <w:jc w:val="center"/>
       </w:pPr>
       <w:r>
@@ -1935,6 +2012,7 @@
     </w:p>
     <w:p>
       <w:pPr>
+        <w:ind w:left="720"/>
         <w:jc w:val="both"/>
       </w:pPr>
       <w:r>
@@ -1944,7 +2022,12 @@
     <w:p>
       <w:pPr>
         <w:pStyle w:val="ListBullet"/>
+        <w:tabs>
+          <w:tab w:val="clear" w:pos="360"/>
+          <w:tab w:val="num" w:pos="1080"/>
+        </w:tabs>
         <w:spacing w:after="60"/>
+        <w:ind w:left="1080"/>
         <w:jc w:val="both"/>
       </w:pPr>
       <w:r>
@@ -1960,7 +2043,12 @@
     <w:p>
       <w:pPr>
         <w:pStyle w:val="ListBullet"/>
+        <w:tabs>
+          <w:tab w:val="clear" w:pos="360"/>
+          <w:tab w:val="num" w:pos="1080"/>
+        </w:tabs>
         <w:spacing w:after="60"/>
+        <w:ind w:left="1080"/>
         <w:jc w:val="both"/>
       </w:pPr>
       <w:r>
@@ -1976,6 +2064,7 @@
     <w:p>
       <w:pPr>
         <w:spacing w:before="120"/>
+        <w:ind w:left="720"/>
         <w:jc w:val="center"/>
       </w:pPr>
       <w:r>
@@ -1991,6 +2080,7 @@
     <w:p>
       <w:pPr>
         <w:spacing w:before="200" w:after="60"/>
+        <w:ind w:left="720"/>
       </w:pPr>
       <w:r>
         <w:rPr>
@@ -2003,6 +2093,7 @@
     </w:p>
     <w:p>
       <w:pPr>
+        <w:ind w:left="720"/>
         <w:jc w:val="both"/>
       </w:pPr>
       <w:r>
@@ -2012,7 +2103,12 @@
     <w:p>
       <w:pPr>
         <w:pStyle w:val="ListBullet"/>
+        <w:tabs>
+          <w:tab w:val="clear" w:pos="360"/>
+          <w:tab w:val="num" w:pos="1080"/>
+        </w:tabs>
         <w:spacing w:after="60"/>
+        <w:ind w:left="1080"/>
         <w:jc w:val="both"/>
       </w:pPr>
       <w:r>
@@ -2028,13 +2124,19 @@
     <w:p>
       <w:pPr>
         <w:pStyle w:val="ListBullet"/>
+        <w:tabs>
+          <w:tab w:val="clear" w:pos="360"/>
+          <w:tab w:val="num" w:pos="1080"/>
+        </w:tabs>
         <w:spacing w:after="60"/>
+        <w:ind w:left="1080"/>
         <w:jc w:val="both"/>
       </w:pPr>
       <w:r>
         <w:rPr>
           <w:b/>
         </w:rPr>
+        <w:lastRenderedPageBreak/>
         <w:t xml:space="preserve">Stage 2 (Cut to Top 50%): </w:t>
       </w:r>
       <w:r>
@@ -2044,7 +2146,12 @@
     <w:p>
       <w:pPr>
         <w:pStyle w:val="ListBullet"/>
+        <w:tabs>
+          <w:tab w:val="clear" w:pos="360"/>
+          <w:tab w:val="num" w:pos="1080"/>
+        </w:tabs>
         <w:spacing w:after="60"/>
+        <w:ind w:left="1080"/>
         <w:jc w:val="both"/>
       </w:pPr>
       <w:r>
@@ -2060,14 +2167,18 @@
     <w:p>
       <w:pPr>
         <w:pStyle w:val="ListBullet"/>
+        <w:tabs>
+          <w:tab w:val="clear" w:pos="360"/>
+          <w:tab w:val="num" w:pos="1080"/>
+        </w:tabs>
         <w:spacing w:after="60"/>
+        <w:ind w:left="1080"/>
         <w:jc w:val="both"/>
       </w:pPr>
       <w:r>
         <w:rPr>
           <w:b/>
         </w:rPr>
-        <w:lastRenderedPageBreak/>
         <w:t xml:space="preserve">Stage 4 (Authorized Finalists): </w:t>
       </w:r>
       <w:r>
@@ -2077,6 +2188,7 @@
     <w:p>
       <w:pPr>
         <w:spacing w:before="200" w:after="60"/>
+        <w:ind w:left="720"/>
       </w:pPr>
       <w:r>
         <w:rPr>
@@ -2089,6 +2201,7 @@
     </w:p>
     <w:p>
       <w:pPr>
+        <w:ind w:left="720"/>
         <w:jc w:val="both"/>
       </w:pPr>
       <w:r>
@@ -2098,6 +2211,7 @@
     <w:p>
       <w:pPr>
         <w:spacing w:before="120"/>
+        <w:ind w:left="720"/>
         <w:jc w:val="center"/>
       </w:pPr>
       <w:r>
@@ -2112,6 +2226,7 @@
     </w:p>
     <w:p>
       <w:pPr>
+        <w:ind w:left="720"/>
         <w:jc w:val="both"/>
       </w:pPr>
       <w:r>
@@ -2121,6 +2236,7 @@
     <w:p>
       <w:pPr>
         <w:spacing w:before="120"/>
+        <w:ind w:left="720"/>
         <w:jc w:val="center"/>
       </w:pPr>
       <w:r>
@@ -2136,6 +2252,7 @@
     <w:p>
       <w:pPr>
         <w:spacing w:before="280" w:after="80"/>
+        <w:ind w:left="720"/>
       </w:pPr>
       <w:r>
         <w:rPr>
@@ -2148,6 +2265,7 @@
     </w:p>
     <w:p>
       <w:pPr>
+        <w:ind w:left="720"/>
         <w:jc w:val="both"/>
       </w:pPr>
       <w:r>
@@ -2157,7 +2275,12 @@
     <w:p>
       <w:pPr>
         <w:pStyle w:val="ListBullet"/>
+        <w:tabs>
+          <w:tab w:val="clear" w:pos="360"/>
+          <w:tab w:val="num" w:pos="1080"/>
+        </w:tabs>
         <w:spacing w:after="60"/>
+        <w:ind w:left="1080"/>
         <w:jc w:val="both"/>
       </w:pPr>
       <w:r>
@@ -2173,13 +2296,19 @@
     <w:p>
       <w:pPr>
         <w:pStyle w:val="ListBullet"/>
+        <w:tabs>
+          <w:tab w:val="clear" w:pos="360"/>
+          <w:tab w:val="num" w:pos="1080"/>
+        </w:tabs>
         <w:spacing w:after="60"/>
+        <w:ind w:left="1080"/>
         <w:jc w:val="both"/>
       </w:pPr>
       <w:r>
         <w:rPr>
           <w:b/>
         </w:rPr>
+        <w:lastRenderedPageBreak/>
         <w:t xml:space="preserve">2. Authentication Gateway (LoginView.jsx): </w:t>
       </w:r>
       <w:r>
@@ -2189,7 +2318,12 @@
     <w:p>
       <w:pPr>
         <w:pStyle w:val="ListBullet"/>
+        <w:tabs>
+          <w:tab w:val="clear" w:pos="360"/>
+          <w:tab w:val="num" w:pos="1080"/>
+        </w:tabs>
         <w:spacing w:after="60"/>
+        <w:ind w:left="1080"/>
         <w:jc w:val="both"/>
       </w:pPr>
       <w:r>
@@ -2205,7 +2339,12 @@
     <w:p>
       <w:pPr>
         <w:pStyle w:val="ListBullet"/>
+        <w:tabs>
+          <w:tab w:val="clear" w:pos="360"/>
+          <w:tab w:val="num" w:pos="1080"/>
+        </w:tabs>
         <w:spacing w:after="60"/>
+        <w:ind w:left="1080"/>
         <w:jc w:val="both"/>
       </w:pPr>
       <w:r>
@@ -2221,14 +2360,18 @@
     <w:p>
       <w:pPr>
         <w:pStyle w:val="ListBullet"/>
+        <w:tabs>
+          <w:tab w:val="clear" w:pos="360"/>
+          <w:tab w:val="num" w:pos="1080"/>
+        </w:tabs>
         <w:spacing w:after="60"/>
+        <w:ind w:left="1080"/>
         <w:jc w:val="both"/>
       </w:pPr>
       <w:r>
         <w:rPr>
           <w:b/>
         </w:rPr>
-        <w:lastRenderedPageBreak/>
         <w:t xml:space="preserve">5. Candidate Rankings (RankingMatrix.jsx - Step 3): </w:t>
       </w:r>
       <w:r>
@@ -2238,7 +2381,12 @@
     <w:p>
       <w:pPr>
         <w:pStyle w:val="ListBullet"/>
+        <w:tabs>
+          <w:tab w:val="clear" w:pos="360"/>
+          <w:tab w:val="num" w:pos="1080"/>
+        </w:tabs>
         <w:spacing w:after="60"/>
+        <w:ind w:left="1080"/>
         <w:jc w:val="both"/>
       </w:pPr>
       <w:r>
@@ -2254,6 +2402,7 @@
     <w:p>
       <w:pPr>
         <w:spacing w:before="280" w:after="80"/>
+        <w:ind w:left="720"/>
       </w:pPr>
       <w:r>
         <w:rPr>
@@ -2266,6 +2415,7 @@
     </w:p>
     <w:p>
       <w:pPr>
+        <w:ind w:left="720"/>
         <w:jc w:val="both"/>
       </w:pPr>
       <w:r>
@@ -2275,6 +2425,7 @@
     <w:p>
       <w:pPr>
         <w:spacing w:before="200" w:after="60"/>
+        <w:ind w:left="720"/>
       </w:pPr>
       <w:r>
         <w:rPr>
@@ -2287,6 +2438,7 @@
     </w:p>
     <w:p>
       <w:pPr>
+        <w:ind w:left="720"/>
         <w:jc w:val="both"/>
       </w:pPr>
       <w:r>
@@ -2296,6 +2448,7 @@
     <w:p>
       <w:pPr>
         <w:spacing w:before="80" w:after="40"/>
+        <w:ind w:left="720"/>
       </w:pPr>
       <w:r>
         <w:rPr>
@@ -2307,7 +2460,7 @@
     </w:p>
     <w:tbl>
       <w:tblPr>
-        <w:tblW w:w="0" w:type="auto"/>
+        <w:tblW w:w="9360" w:type="dxa"/>
         <w:jc w:val="center"/>
         <w:tblLook w:val="04A0" w:firstRow="1" w:lastRow="0" w:firstColumn="1" w:lastColumn="0" w:noHBand="0" w:noVBand="1"/>
       </w:tblPr>
@@ -2544,7 +2697,14 @@
                 <w:sz w:val="18"/>
               </w:rPr>
               <w:br/>
-              <w:t>Cand: [python, docker, postgresql, react, git]</w:t>
+              <w:t xml:space="preserve">Cand: [python, docker, postgresql, react, </w:t>
+            </w:r>
+            <w:r>
+              <w:rPr>
+                <w:sz w:val="18"/>
+              </w:rPr>
+              <w:lastRenderedPageBreak/>
+              <w:t>git]</w:t>
             </w:r>
           </w:p>
         </w:tc>
@@ -2567,6 +2727,7 @@
               <w:rPr>
                 <w:sz w:val="18"/>
               </w:rPr>
+              <w:lastRenderedPageBreak/>
               <w:t>S_h = 1.0 (100% density)</w:t>
             </w:r>
           </w:p>
@@ -3087,7 +3248,6 @@
               <w:rPr>
                 <w:sz w:val="18"/>
               </w:rPr>
-              <w:lastRenderedPageBreak/>
               <w:t>UT-05</w:t>
             </w:r>
           </w:p>
@@ -3935,7 +4095,14 @@
                 <w:sz w:val="18"/>
               </w:rPr>
               <w:br/>
-              <w:t>scores = [0.90, 0.80, 0.70, 0.85, 1.0]</w:t>
+              <w:t xml:space="preserve">scores = [0.90, 0.80, 0.70, 0.85, </w:t>
+            </w:r>
+            <w:r>
+              <w:rPr>
+                <w:sz w:val="18"/>
+              </w:rPr>
+              <w:lastRenderedPageBreak/>
+              <w:t>1.0]</w:t>
             </w:r>
           </w:p>
         </w:tc>
@@ -3957,6 +4124,7 @@
               <w:rPr>
                 <w:sz w:val="18"/>
               </w:rPr>
+              <w:lastRenderedPageBreak/>
               <w:t>S_final = 85.25%</w:t>
             </w:r>
           </w:p>
@@ -4009,10 +4177,15 @@
         </w:tc>
       </w:tr>
     </w:tbl>
-    <w:p/>
+    <w:p>
+      <w:pPr>
+        <w:ind w:left="720"/>
+      </w:pPr>
+    </w:p>
     <w:p>
       <w:pPr>
         <w:spacing w:before="200" w:after="60"/>
+        <w:ind w:left="720"/>
       </w:pPr>
       <w:r>
         <w:rPr>
@@ -4026,7 +4199,12 @@
     <w:p>
       <w:pPr>
         <w:pStyle w:val="ListBullet"/>
+        <w:tabs>
+          <w:tab w:val="clear" w:pos="360"/>
+          <w:tab w:val="num" w:pos="1080"/>
+        </w:tabs>
         <w:spacing w:after="60"/>
+        <w:ind w:left="1080"/>
         <w:jc w:val="both"/>
       </w:pPr>
       <w:r>
@@ -4042,7 +4220,12 @@
     <w:p>
       <w:pPr>
         <w:pStyle w:val="ListBullet"/>
+        <w:tabs>
+          <w:tab w:val="clear" w:pos="360"/>
+          <w:tab w:val="num" w:pos="1080"/>
+        </w:tabs>
         <w:spacing w:after="60"/>
+        <w:ind w:left="1080"/>
         <w:jc w:val="both"/>
       </w:pPr>
       <w:r>
@@ -4058,14 +4241,18 @@
     <w:p>
       <w:pPr>
         <w:pStyle w:val="ListBullet"/>
+        <w:tabs>
+          <w:tab w:val="clear" w:pos="360"/>
+          <w:tab w:val="num" w:pos="1080"/>
+        </w:tabs>
         <w:spacing w:after="60"/>
+        <w:ind w:left="1080"/>
         <w:jc w:val="both"/>
       </w:pPr>
       <w:r>
         <w:rPr>
           <w:b/>
         </w:rPr>
-        <w:lastRenderedPageBreak/>
         <w:t xml:space="preserve">Batch Archive Ingestion: </w:t>
       </w:r>
       <w:r>
@@ -4075,6 +4262,7 @@
     <w:p>
       <w:pPr>
         <w:spacing w:before="200" w:after="60"/>
+        <w:ind w:left="720"/>
       </w:pPr>
       <w:r>
         <w:rPr>
@@ -4088,7 +4276,12 @@
     <w:p>
       <w:pPr>
         <w:pStyle w:val="ListBullet"/>
+        <w:tabs>
+          <w:tab w:val="clear" w:pos="360"/>
+          <w:tab w:val="num" w:pos="1080"/>
+        </w:tabs>
         <w:spacing w:after="60"/>
+        <w:ind w:left="1080"/>
         <w:jc w:val="both"/>
       </w:pPr>
       <w:r>
@@ -4104,7 +4297,12 @@
     <w:p>
       <w:pPr>
         <w:pStyle w:val="ListBullet"/>
+        <w:tabs>
+          <w:tab w:val="clear" w:pos="360"/>
+          <w:tab w:val="num" w:pos="1080"/>
+        </w:tabs>
         <w:spacing w:after="60"/>
+        <w:ind w:left="1080"/>
         <w:jc w:val="both"/>
       </w:pPr>
       <w:r>
@@ -4120,6 +4318,7 @@
     <w:p>
       <w:pPr>
         <w:spacing w:before="200" w:after="60"/>
+        <w:ind w:left="720"/>
       </w:pPr>
       <w:r>
         <w:rPr>
@@ -4132,6 +4331,7 @@
     </w:p>
     <w:p>
       <w:pPr>
+        <w:ind w:left="720"/>
         <w:jc w:val="both"/>
       </w:pPr>
       <w:r>
@@ -4141,6 +4341,7 @@
     <w:p>
       <w:pPr>
         <w:spacing w:before="280" w:after="80"/>
+        <w:ind w:left="720"/>
       </w:pPr>
       <w:r>
         <w:rPr>
@@ -4153,6 +4354,7 @@
     </w:p>
     <w:p>
       <w:pPr>
+        <w:ind w:left="720"/>
         <w:jc w:val="both"/>
       </w:pPr>
       <w:r>
@@ -4162,6 +4364,7 @@
     <w:p>
       <w:pPr>
         <w:spacing w:before="200" w:after="60"/>
+        <w:ind w:left="720"/>
       </w:pPr>
       <w:r>
         <w:rPr>
@@ -4175,13 +4378,19 @@
     <w:p>
       <w:pPr>
         <w:pStyle w:val="ListBullet"/>
+        <w:tabs>
+          <w:tab w:val="clear" w:pos="360"/>
+          <w:tab w:val="num" w:pos="1080"/>
+        </w:tabs>
         <w:spacing w:after="60"/>
+        <w:ind w:left="1080"/>
         <w:jc w:val="both"/>
       </w:pPr>
       <w:r>
         <w:rPr>
           <w:b/>
         </w:rPr>
+        <w:lastRenderedPageBreak/>
         <w:t xml:space="preserve">Single Resume Latency: </w:t>
       </w:r>
       <w:r>
@@ -4191,7 +4400,12 @@
     <w:p>
       <w:pPr>
         <w:pStyle w:val="ListBullet"/>
+        <w:tabs>
+          <w:tab w:val="clear" w:pos="360"/>
+          <w:tab w:val="num" w:pos="1080"/>
+        </w:tabs>
         <w:spacing w:after="60"/>
+        <w:ind w:left="1080"/>
         <w:jc w:val="both"/>
       </w:pPr>
       <w:r>
@@ -4207,6 +4421,7 @@
     <w:p>
       <w:pPr>
         <w:spacing w:before="200" w:after="60"/>
+        <w:ind w:left="720"/>
       </w:pPr>
       <w:r>
         <w:rPr>
@@ -4219,6 +4434,7 @@
     </w:p>
     <w:p>
       <w:pPr>
+        <w:ind w:left="720"/>
         <w:jc w:val="both"/>
       </w:pPr>
       <w:r>
@@ -4228,19 +4444,19 @@
     <w:p>
       <w:pPr>
         <w:spacing w:before="80" w:after="40"/>
+        <w:ind w:left="720"/>
       </w:pPr>
       <w:r>
         <w:rPr>
           <w:b/>
           <w:sz w:val="22"/>
         </w:rPr>
-        <w:lastRenderedPageBreak/>
         <w:t>Table 4.3: Candidate Scoring Distribution Across Progressive Funnel Stages</w:t>
       </w:r>
     </w:p>
     <w:tbl>
       <w:tblPr>
-        <w:tblW w:w="0" w:type="auto"/>
+        <w:tblW w:w="9360" w:type="dxa"/>
         <w:jc w:val="center"/>
         <w:tblLook w:val="04A0" w:firstRow="1" w:lastRow="0" w:firstColumn="1" w:lastColumn="0" w:noHBand="0" w:noVBand="1"/>
       </w:tblPr>
@@ -4962,10 +5178,15 @@
         </w:tc>
       </w:tr>
     </w:tbl>
-    <w:p/>
+    <w:p>
+      <w:pPr>
+        <w:ind w:left="720"/>
+      </w:pPr>
+    </w:p>
     <w:p>
       <w:pPr>
         <w:spacing w:before="200" w:after="60"/>
+        <w:ind w:left="720"/>
       </w:pPr>
       <w:r>
         <w:rPr>
@@ -4979,7 +5200,12 @@
     <w:p>
       <w:pPr>
         <w:pStyle w:val="ListBullet"/>
+        <w:tabs>
+          <w:tab w:val="clear" w:pos="360"/>
+          <w:tab w:val="num" w:pos="1080"/>
+        </w:tabs>
         <w:spacing w:after="60"/>
+        <w:ind w:left="1080"/>
         <w:jc w:val="both"/>
       </w:pPr>
       <w:r>
@@ -4995,7 +5221,12 @@
     <w:p>
       <w:pPr>
         <w:pStyle w:val="ListBullet"/>
+        <w:tabs>
+          <w:tab w:val="clear" w:pos="360"/>
+          <w:tab w:val="num" w:pos="1080"/>
+        </w:tabs>
         <w:spacing w:after="60"/>
+        <w:ind w:left="1080"/>
         <w:jc w:val="both"/>
       </w:pPr>
       <w:r>
@@ -5011,6 +5242,7 @@
     <w:p>
       <w:pPr>
         <w:spacing w:before="280" w:after="80"/>
+        <w:ind w:left="720"/>
       </w:pPr>
       <w:r>
         <w:rPr>
@@ -5023,9 +5255,11 @@
     </w:p>
     <w:p>
       <w:pPr>
+        <w:ind w:left="720"/>
         <w:jc w:val="both"/>
       </w:pPr>
       <w:r>
+        <w:lastRenderedPageBreak/>
         <w:t>Chapter Four presented the complete system implementation, architecture walkthrough, user interface realization, and testing methodology for RecruitIQ. By unifying layout-aware document extraction, recruiter-discretionary bias scrubbing, 5-Dimension SBERT scoring, progressive halving funnels, and SHAP-driven explainability, the implemented platform overcomes the lexical rigidity, demographic bias, and black-box opacity of conventional recruitment tools. Automated verification and empirical benchmarking confirmed that RecruitIQ operates with high throughput, robust mathematical accuracy, and certified demographic fairness, establishing a solid foundation for Chapter Five's conclusions and recommendations.</w:t>
       </w:r>
     </w:p>
@@ -5194,7 +5428,7 @@
   <w:abstractNum w:abstractNumId="8" w15:restartNumberingAfterBreak="0">
     <w:nsid w:val="FFFFFF89"/>
     <w:multiLevelType w:val="singleLevel"/>
-    <w:tmpl w:val="29761A62"/>
+    <w:tmpl w:val="A1189766"/>
     <w:lvl w:ilvl="0">
       <w:start w:val="1"/>
       <w:numFmt w:val="bullet"/>

</xml_diff>